<commit_message>
update: Edition 043 newsletter content
</commit_message>
<xml_diff>
--- a/backend/public/newsletters/14-03-2026_Edition 043/Stacking & Blending Combining Algorithms for Maximum Accuracy.docx
+++ b/backend/public/newsletters/14-03-2026_Edition 043/Stacking & Blending Combining Algorithms for Maximum Accuracy.docx
@@ -54,7 +54,7 @@
     <w:p>
       <w:r>
         <w:pict w14:anchorId="55F0F600">
-          <v:rect id="_x0000_i1175" style="width:0;height:1.5pt" o:hralign="center" o:hrstd="t" o:hr="t" fillcolor="#a0a0a0" stroked="f"/>
+          <v:rect id="_x0000_i1025" style="width:0;height:1.5pt" o:hralign="center" o:hrstd="t" o:hr="t" fillcolor="#a0a0a0" stroked="f"/>
         </w:pict>
       </w:r>
     </w:p>
@@ -116,8 +116,13 @@
         </w:numPr>
       </w:pPr>
       <w:r>
-        <w:t>One doctor studies blood reports</w:t>
-      </w:r>
+        <w:t xml:space="preserve">One doctor studies blood </w:t>
+      </w:r>
+      <w:proofErr w:type="gramStart"/>
+      <w:r>
+        <w:t>reports</w:t>
+      </w:r>
+      <w:proofErr w:type="gramEnd"/>
     </w:p>
     <w:p>
       <w:pPr>
@@ -154,7 +159,7 @@
     <w:p>
       <w:r>
         <w:pict w14:anchorId="181A4BC6">
-          <v:rect id="_x0000_i1176" style="width:0;height:1.5pt" o:hralign="center" o:hrstd="t" o:hr="t" fillcolor="#a0a0a0" stroked="f"/>
+          <v:rect id="_x0000_i1026" style="width:0;height:1.5pt" o:hralign="center" o:hrstd="t" o:hr="t" fillcolor="#a0a0a0" stroked="f"/>
         </w:pict>
       </w:r>
     </w:p>
@@ -288,7 +293,7 @@
     <w:p>
       <w:r>
         <w:pict w14:anchorId="43D9A260">
-          <v:rect id="_x0000_i1177" style="width:0;height:1.5pt" o:hralign="center" o:hrstd="t" o:hr="t" fillcolor="#a0a0a0" stroked="f"/>
+          <v:rect id="_x0000_i1027" style="width:0;height:1.5pt" o:hralign="center" o:hrstd="t" o:hr="t" fillcolor="#a0a0a0" stroked="f"/>
         </w:pict>
       </w:r>
     </w:p>
@@ -488,7 +493,7 @@
     <w:p>
       <w:r>
         <w:pict w14:anchorId="51D0A0BC">
-          <v:rect id="_x0000_i1179" style="width:0;height:1.5pt" o:hralign="center" o:hrstd="t" o:hr="t" fillcolor="#a0a0a0" stroked="f"/>
+          <v:rect id="_x0000_i1028" style="width:0;height:1.5pt" o:hralign="center" o:hrstd="t" o:hr="t" fillcolor="#a0a0a0" stroked="f"/>
         </w:pict>
       </w:r>
     </w:p>
@@ -674,7 +679,7 @@
     <w:p>
       <w:r>
         <w:pict w14:anchorId="4BB32E61">
-          <v:rect id="_x0000_i1180" style="width:0;height:1.5pt" o:hralign="center" o:hrstd="t" o:hr="t" fillcolor="#a0a0a0" stroked="f"/>
+          <v:rect id="_x0000_i1029" style="width:0;height:1.5pt" o:hralign="center" o:hrstd="t" o:hr="t" fillcolor="#a0a0a0" stroked="f"/>
         </w:pict>
       </w:r>
     </w:p>
@@ -770,7 +775,7 @@
     <w:p>
       <w:r>
         <w:pict w14:anchorId="34071029">
-          <v:rect id="_x0000_i1181" style="width:0;height:1.5pt" o:hralign="center" o:hrstd="t" o:hr="t" fillcolor="#a0a0a0" stroked="f"/>
+          <v:rect id="_x0000_i1030" style="width:0;height:1.5pt" o:hralign="center" o:hrstd="t" o:hr="t" fillcolor="#a0a0a0" stroked="f"/>
         </w:pict>
       </w:r>
     </w:p>
@@ -937,7 +942,7 @@
     <w:p>
       <w:r>
         <w:pict w14:anchorId="0E03D555">
-          <v:rect id="_x0000_i1182" style="width:0;height:1.5pt" o:hralign="center" o:hrstd="t" o:hr="t" fillcolor="#a0a0a0" stroked="f"/>
+          <v:rect id="_x0000_i1031" style="width:0;height:1.5pt" o:hralign="center" o:hrstd="t" o:hr="t" fillcolor="#a0a0a0" stroked="f"/>
         </w:pict>
       </w:r>
     </w:p>
@@ -1047,7 +1052,7 @@
     <w:p>
       <w:r>
         <w:pict w14:anchorId="441BC897">
-          <v:rect id="_x0000_i1183" style="width:0;height:1.5pt" o:hralign="center" o:hrstd="t" o:hr="t" fillcolor="#a0a0a0" stroked="f"/>
+          <v:rect id="_x0000_i1032" style="width:0;height:1.5pt" o:hralign="center" o:hrstd="t" o:hr="t" fillcolor="#a0a0a0" stroked="f"/>
         </w:pict>
       </w:r>
     </w:p>
@@ -1151,7 +1156,7 @@
     <w:p>
       <w:r>
         <w:pict w14:anchorId="78EB10DC">
-          <v:rect id="_x0000_i1184" style="width:0;height:1.5pt" o:hralign="center" o:hrstd="t" o:hr="t" fillcolor="#a0a0a0" stroked="f"/>
+          <v:rect id="_x0000_i1033" style="width:0;height:1.5pt" o:hralign="center" o:hrstd="t" o:hr="t" fillcolor="#a0a0a0" stroked="f"/>
         </w:pict>
       </w:r>
     </w:p>
@@ -1251,7 +1256,7 @@
     <w:p>
       <w:r>
         <w:pict w14:anchorId="6CF2B71D">
-          <v:rect id="_x0000_i1185" style="width:0;height:1.5pt" o:hralign="center" o:hrstd="t" o:hr="t" fillcolor="#a0a0a0" stroked="f"/>
+          <v:rect id="_x0000_i1034" style="width:0;height:1.5pt" o:hralign="center" o:hrstd="t" o:hr="t" fillcolor="#a0a0a0" stroked="f"/>
         </w:pict>
       </w:r>
     </w:p>
@@ -1358,7 +1363,7 @@
     <w:p>
       <w:r>
         <w:pict w14:anchorId="3667C2A8">
-          <v:rect id="_x0000_i1186" style="width:0;height:1.5pt" o:hralign="center" o:hrstd="t" o:hr="t" fillcolor="#a0a0a0" stroked="f"/>
+          <v:rect id="_x0000_i1035" style="width:0;height:1.5pt" o:hralign="center" o:hrstd="t" o:hr="t" fillcolor="#a0a0a0" stroked="f"/>
         </w:pict>
       </w:r>
     </w:p>
@@ -1657,7 +1662,7 @@
     <w:p>
       <w:r>
         <w:pict w14:anchorId="1F1C6578">
-          <v:rect id="_x0000_i1192" style="width:0;height:1.5pt" o:hralign="center" o:hrstd="t" o:hr="t" fillcolor="#a0a0a0" stroked="f"/>
+          <v:rect id="_x0000_i1036" style="width:0;height:1.5pt" o:hralign="center" o:hrstd="t" o:hr="t" fillcolor="#a0a0a0" stroked="f"/>
         </w:pict>
       </w:r>
     </w:p>
@@ -1808,8 +1813,13 @@
       </w:r>
     </w:p>
     <w:p>
-      <w:r>
-        <w:t xml:space="preserve">Otherwise the meta-model learns from </w:t>
+      <w:proofErr w:type="gramStart"/>
+      <w:r>
+        <w:t>Otherwise</w:t>
+      </w:r>
+      <w:proofErr w:type="gramEnd"/>
+      <w:r>
+        <w:t xml:space="preserve"> the meta-model learns from </w:t>
       </w:r>
       <w:r>
         <w:rPr>
@@ -1825,7 +1835,7 @@
     <w:p>
       <w:r>
         <w:pict w14:anchorId="464FB311">
-          <v:rect id="_x0000_i1194" style="width:0;height:1.5pt" o:hralign="center" o:hrstd="t" o:hr="t" fillcolor="#a0a0a0" stroked="f"/>
+          <v:rect id="_x0000_i1037" style="width:0;height:1.5pt" o:hralign="center" o:hrstd="t" o:hr="t" fillcolor="#a0a0a0" stroked="f"/>
         </w:pict>
       </w:r>
     </w:p>
@@ -1878,7 +1888,7 @@
     <w:p>
       <w:r>
         <w:pict w14:anchorId="7A957375">
-          <v:rect id="_x0000_i1195" style="width:0;height:1.5pt" o:hralign="center" o:hrstd="t" o:hr="t" fillcolor="#a0a0a0" stroked="f"/>
+          <v:rect id="_x0000_i1038" style="width:0;height:1.5pt" o:hralign="center" o:hrstd="t" o:hr="t" fillcolor="#a0a0a0" stroked="f"/>
         </w:pict>
       </w:r>
     </w:p>
@@ -2008,7 +2018,7 @@
     <w:p>
       <w:r>
         <w:pict w14:anchorId="5C46AB9C">
-          <v:rect id="_x0000_i1197" style="width:0;height:1.5pt" o:hralign="center" o:hrstd="t" o:hr="t" fillcolor="#a0a0a0" stroked="f"/>
+          <v:rect id="_x0000_i1039" style="width:0;height:1.5pt" o:hralign="center" o:hrstd="t" o:hr="t" fillcolor="#a0a0a0" stroked="f"/>
         </w:pict>
       </w:r>
     </w:p>
@@ -2106,310 +2116,6 @@
         <w:t xml:space="preserve"> for weekly deep dives into AI, machine learning, and real-world data science.</w:t>
       </w:r>
     </w:p>
-    <w:p>
-      <w:r>
-        <w:lastRenderedPageBreak/>
-        <w:t xml:space="preserve">Most beginner data scientists believe the secret to high accuracy is finding </w:t>
-      </w:r>
-      <w:r>
-        <w:rPr>
-          <w:b/>
-          <w:bCs/>
-        </w:rPr>
-        <w:t>the perfect algorithm</w:t>
-      </w:r>
-      <w:r>
-        <w:t>.</w:t>
-      </w:r>
-    </w:p>
-    <w:p>
-      <w:r>
-        <w:t>But here’s what Kaggle winners and production ML teams actually do:</w:t>
-      </w:r>
-    </w:p>
-    <w:p>
-      <w:r>
-        <w:t xml:space="preserve">They </w:t>
-      </w:r>
-      <w:r>
-        <w:rPr>
-          <w:b/>
-          <w:bCs/>
-        </w:rPr>
-        <w:t>don’t choose one model.</w:t>
-      </w:r>
-      <w:r>
-        <w:br/>
-        <w:t>They combine many.</w:t>
-      </w:r>
-    </w:p>
-    <w:p>
-      <w:r>
-        <w:t xml:space="preserve">This strategy is called </w:t>
-      </w:r>
-      <w:r>
-        <w:rPr>
-          <w:b/>
-          <w:bCs/>
-        </w:rPr>
-        <w:t>Stacking &amp; Blending</w:t>
-      </w:r>
-      <w:r>
-        <w:t>.</w:t>
-      </w:r>
-    </w:p>
-    <w:p>
-      <w:r>
-        <w:t>And it’s one of the most powerful techniques in modern machine learning.</w:t>
-      </w:r>
-    </w:p>
-    <w:p>
-      <w:r>
-        <w:t>Instead of asking:</w:t>
-      </w:r>
-    </w:p>
-    <w:p>
-      <w:r>
-        <w:t>“Which algorithm is best?”</w:t>
-      </w:r>
-    </w:p>
-    <w:p>
-      <w:r>
-        <w:t>You ask a smarter question:</w:t>
-      </w:r>
-    </w:p>
-    <w:p>
-      <w:r>
-        <w:t>“What happens when multiple algorithms collaborate?”</w:t>
-      </w:r>
-    </w:p>
-    <w:p>
-      <w:r>
-        <w:t>Imagine combining:</w:t>
-      </w:r>
-    </w:p>
-    <w:p>
-      <w:r>
-        <w:t>• Random Forest</w:t>
-      </w:r>
-      <w:r>
-        <w:br/>
-        <w:t>• XGBoost</w:t>
-      </w:r>
-      <w:r>
-        <w:br/>
-        <w:t>• Neural Networks</w:t>
-      </w:r>
-    </w:p>
-    <w:p>
-      <w:r>
-        <w:t xml:space="preserve">Then training another model that </w:t>
-      </w:r>
-      <w:r>
-        <w:rPr>
-          <w:b/>
-          <w:bCs/>
-        </w:rPr>
-        <w:t>learns which one to trust in different situations.</w:t>
-      </w:r>
-    </w:p>
-    <w:p>
-      <w:r>
-        <w:t>That’s stacking.</w:t>
-      </w:r>
-    </w:p>
-    <w:p>
-      <w:r>
-        <w:t>And the result?</w:t>
-      </w:r>
-    </w:p>
-    <w:p>
-      <w:r>
-        <w:t xml:space="preserve">Often </w:t>
-      </w:r>
-      <w:r>
-        <w:rPr>
-          <w:b/>
-          <w:bCs/>
-        </w:rPr>
-        <w:t>dramatically higher accuracy</w:t>
-      </w:r>
-      <w:r>
-        <w:t xml:space="preserve"> than any single model.</w:t>
-      </w:r>
-    </w:p>
-    <w:p>
-      <w:r>
-        <w:t>This is why stacking appears in:</w:t>
-      </w:r>
-    </w:p>
-    <w:p>
-      <w:r>
-        <w:t>• Kaggle winning solutions</w:t>
-      </w:r>
-      <w:r>
-        <w:br/>
-        <w:t>• Fraud detection systems</w:t>
-      </w:r>
-      <w:r>
-        <w:br/>
-        <w:t>• Recommendation engines</w:t>
-      </w:r>
-      <w:r>
-        <w:br/>
-        <w:t>• Financial risk models</w:t>
-      </w:r>
-    </w:p>
-    <w:p>
-      <w:r>
-        <w:t xml:space="preserve">Yet surprisingly, most aspiring data scientists </w:t>
-      </w:r>
-      <w:r>
-        <w:rPr>
-          <w:b/>
-          <w:bCs/>
-        </w:rPr>
-        <w:t>never learn it deeply.</w:t>
-      </w:r>
-    </w:p>
-    <w:p>
-      <w:r>
-        <w:t>So,</w:t>
-      </w:r>
-      <w:r>
-        <w:t xml:space="preserve"> in this week’s </w:t>
-      </w:r>
-      <w:r>
-        <w:rPr>
-          <w:b/>
-          <w:bCs/>
-        </w:rPr>
-        <w:t>insightforge.ai newsletter</w:t>
-      </w:r>
-      <w:r>
-        <w:t>, I break down:</w:t>
-      </w:r>
-    </w:p>
-    <w:p>
-      <w:r>
-        <w:t>• What stacking and blending really are</w:t>
-      </w:r>
-      <w:r>
-        <w:br/>
-        <w:t>• The intuition behind ensemble learning</w:t>
-      </w:r>
-      <w:r>
-        <w:br/>
-        <w:t>• When stacking actually improves performance</w:t>
-      </w:r>
-      <w:r>
-        <w:br/>
-        <w:t xml:space="preserve">• Tools like scikit-learn, XGBoost, and </w:t>
-      </w:r>
-      <w:proofErr w:type="spellStart"/>
-      <w:r>
-        <w:t>LightGBM</w:t>
-      </w:r>
-      <w:proofErr w:type="spellEnd"/>
-      <w:r>
-        <w:br/>
-        <w:t>• A real industry use case step by step</w:t>
-      </w:r>
-    </w:p>
-    <w:p>
-      <w:r>
-        <w:lastRenderedPageBreak/>
-        <w:t xml:space="preserve">If you want to move from </w:t>
-      </w:r>
-      <w:r>
-        <w:rPr>
-          <w:b/>
-          <w:bCs/>
-        </w:rPr>
-        <w:t>“training models” → to building real ML systems</w:t>
-      </w:r>
-      <w:r>
-        <w:t>, this concept is a must-learn.</w:t>
-      </w:r>
-    </w:p>
-    <w:p>
-      <w:r>
-        <w:t>Because in real machine learning…</w:t>
-      </w:r>
-    </w:p>
-    <w:p>
-      <w:r>
-        <w:t xml:space="preserve">The best model is often </w:t>
-      </w:r>
-      <w:r>
-        <w:rPr>
-          <w:b/>
-          <w:bCs/>
-        </w:rPr>
-        <w:t>not one model.</w:t>
-      </w:r>
-    </w:p>
-    <w:p>
-      <w:r>
-        <w:t xml:space="preserve">It’s </w:t>
-      </w:r>
-      <w:r>
-        <w:rPr>
-          <w:b/>
-          <w:bCs/>
-        </w:rPr>
-        <w:t>a team of models.</w:t>
-      </w:r>
-    </w:p>
-    <w:p>
-      <w:r>
-        <w:t>Read the full deep dive below.</w:t>
-      </w:r>
-    </w:p>
-    <w:p>
-      <w:r>
-        <w:t>And tell me in the comments:</w:t>
-      </w:r>
-    </w:p>
-    <w:p>
-      <w:r>
-        <w:rPr>
-          <w:b/>
-          <w:bCs/>
-        </w:rPr>
-        <w:t>What’s the most interesting ensemble technique you've tried so far?</w:t>
-      </w:r>
-    </w:p>
-    <w:p>
-      <w:r>
-        <w:t>#MachineLearning</w:t>
-      </w:r>
-      <w:r>
-        <w:t xml:space="preserve"> </w:t>
-      </w:r>
-      <w:r>
-        <w:t>#DataScience</w:t>
-      </w:r>
-      <w:r>
-        <w:t xml:space="preserve"> </w:t>
-      </w:r>
-      <w:r>
-        <w:t>#AIEngineering</w:t>
-      </w:r>
-      <w:r>
-        <w:t xml:space="preserve"> </w:t>
-      </w:r>
-      <w:r>
-        <w:t>#EnsembleLearning</w:t>
-      </w:r>
-      <w:r>
-        <w:t xml:space="preserve"> </w:t>
-      </w:r>
-      <w:r>
-        <w:t>#InsightforgeAI</w:t>
-      </w:r>
-    </w:p>
-    <w:p/>
     <w:sectPr>
       <w:pgSz w:w="11906" w:h="16838"/>
       <w:pgMar w:top="1440" w:right="1440" w:bottom="1440" w:left="1440" w:header="708" w:footer="708" w:gutter="0"/>
@@ -6032,6 +5738,7 @@
   <w:style w:type="character" w:default="1" w:styleId="DefaultParagraphFont">
     <w:name w:val="Default Paragraph Font"/>
     <w:uiPriority w:val="1"/>
+    <w:semiHidden/>
     <w:unhideWhenUsed/>
   </w:style>
   <w:style w:type="table" w:default="1" w:styleId="TableNormal">

</xml_diff>